<commit_message>
Extend Word test corpus with rich objects and advanced layout
Adds equations, text boxes, shapes, charts, SmartArt, content controls,
nested tables, multi-column sections, endnotes, first-page headers,
bookmarks with cross-references, exact line spacing and hidden text.
All eight corpus documents round-trip pixel-identically in Word.

Co-Authored-By: Claude Opus 5.5 <noreply@anthropic.com>
</commit_message>
<xml_diff>
--- a/tests/corpus/01_styles.docx
+++ b/tests/corpus/01_styles.docx
@@ -555,7 +555,7 @@
     <w:link w:val="Heading1Char"/>
     <w:uiPriority w:val="9"/>
     <w:qFormat/>
-    <w:rsid w:val="008953BE"/>
+    <w:rsid w:val="00FF4920"/>
     <w:pPr>
       <w:keepNext/>
       <w:keepLines/>
@@ -577,7 +577,7 @@
     <w:uiPriority w:val="9"/>
     <w:unhideWhenUsed/>
     <w:qFormat/>
-    <w:rsid w:val="008953BE"/>
+    <w:rsid w:val="00FF4920"/>
     <w:pPr>
       <w:keepNext/>
       <w:keepLines/>
@@ -600,7 +600,7 @@
     <w:semiHidden/>
     <w:unhideWhenUsed/>
     <w:qFormat/>
-    <w:rsid w:val="008953BE"/>
+    <w:rsid w:val="00FF4920"/>
     <w:pPr>
       <w:keepNext/>
       <w:keepLines/>
@@ -623,7 +623,7 @@
     <w:semiHidden/>
     <w:unhideWhenUsed/>
     <w:qFormat/>
-    <w:rsid w:val="008953BE"/>
+    <w:rsid w:val="00FF4920"/>
     <w:pPr>
       <w:keepNext/>
       <w:keepLines/>
@@ -646,7 +646,7 @@
     <w:semiHidden/>
     <w:unhideWhenUsed/>
     <w:qFormat/>
-    <w:rsid w:val="008953BE"/>
+    <w:rsid w:val="00FF4920"/>
     <w:pPr>
       <w:keepNext/>
       <w:keepLines/>
@@ -667,7 +667,7 @@
     <w:semiHidden/>
     <w:unhideWhenUsed/>
     <w:qFormat/>
-    <w:rsid w:val="008953BE"/>
+    <w:rsid w:val="00FF4920"/>
     <w:pPr>
       <w:keepNext/>
       <w:keepLines/>
@@ -690,7 +690,7 @@
     <w:semiHidden/>
     <w:unhideWhenUsed/>
     <w:qFormat/>
-    <w:rsid w:val="008953BE"/>
+    <w:rsid w:val="00FF4920"/>
     <w:pPr>
       <w:keepNext/>
       <w:keepLines/>
@@ -711,7 +711,7 @@
     <w:semiHidden/>
     <w:unhideWhenUsed/>
     <w:qFormat/>
-    <w:rsid w:val="008953BE"/>
+    <w:rsid w:val="00FF4920"/>
     <w:pPr>
       <w:keepNext/>
       <w:keepLines/>
@@ -734,7 +734,7 @@
     <w:semiHidden/>
     <w:unhideWhenUsed/>
     <w:qFormat/>
-    <w:rsid w:val="008953BE"/>
+    <w:rsid w:val="00FF4920"/>
     <w:pPr>
       <w:keepNext/>
       <w:keepLines/>
@@ -777,7 +777,7 @@
     <w:basedOn w:val="DefaultParagraphFont"/>
     <w:link w:val="Heading1"/>
     <w:uiPriority w:val="9"/>
-    <w:rsid w:val="008953BE"/>
+    <w:rsid w:val="00FF4920"/>
     <w:rPr>
       <w:rFonts w:asciiTheme="majorHAnsi" w:eastAsiaTheme="majorEastAsia" w:hAnsiTheme="majorHAnsi" w:cstheme="majorBidi"/>
       <w:color w:val="2F5496" w:themeColor="accent1" w:themeShade="BF"/>
@@ -790,7 +790,7 @@
     <w:basedOn w:val="DefaultParagraphFont"/>
     <w:link w:val="Heading2"/>
     <w:uiPriority w:val="9"/>
-    <w:rsid w:val="008953BE"/>
+    <w:rsid w:val="00FF4920"/>
     <w:rPr>
       <w:rFonts w:asciiTheme="majorHAnsi" w:eastAsiaTheme="majorEastAsia" w:hAnsiTheme="majorHAnsi" w:cstheme="majorBidi"/>
       <w:color w:val="2F5496" w:themeColor="accent1" w:themeShade="BF"/>
@@ -804,7 +804,7 @@
     <w:link w:val="Heading3"/>
     <w:uiPriority w:val="9"/>
     <w:semiHidden/>
-    <w:rsid w:val="008953BE"/>
+    <w:rsid w:val="00FF4920"/>
     <w:rPr>
       <w:rFonts w:eastAsiaTheme="majorEastAsia" w:cstheme="majorBidi"/>
       <w:color w:val="2F5496" w:themeColor="accent1" w:themeShade="BF"/>
@@ -818,7 +818,7 @@
     <w:link w:val="Heading4"/>
     <w:uiPriority w:val="9"/>
     <w:semiHidden/>
-    <w:rsid w:val="008953BE"/>
+    <w:rsid w:val="00FF4920"/>
     <w:rPr>
       <w:rFonts w:eastAsiaTheme="majorEastAsia" w:cstheme="majorBidi"/>
       <w:i/>
@@ -832,7 +832,7 @@
     <w:link w:val="Heading5"/>
     <w:uiPriority w:val="9"/>
     <w:semiHidden/>
-    <w:rsid w:val="008953BE"/>
+    <w:rsid w:val="00FF4920"/>
     <w:rPr>
       <w:rFonts w:eastAsiaTheme="majorEastAsia" w:cstheme="majorBidi"/>
       <w:color w:val="2F5496" w:themeColor="accent1" w:themeShade="BF"/>
@@ -844,7 +844,7 @@
     <w:link w:val="Heading6"/>
     <w:uiPriority w:val="9"/>
     <w:semiHidden/>
-    <w:rsid w:val="008953BE"/>
+    <w:rsid w:val="00FF4920"/>
     <w:rPr>
       <w:rFonts w:eastAsiaTheme="majorEastAsia" w:cstheme="majorBidi"/>
       <w:i/>
@@ -858,7 +858,7 @@
     <w:link w:val="Heading7"/>
     <w:uiPriority w:val="9"/>
     <w:semiHidden/>
-    <w:rsid w:val="008953BE"/>
+    <w:rsid w:val="00FF4920"/>
     <w:rPr>
       <w:rFonts w:eastAsiaTheme="majorEastAsia" w:cstheme="majorBidi"/>
       <w:color w:val="595959" w:themeColor="text1" w:themeTint="A6"/>
@@ -870,7 +870,7 @@
     <w:link w:val="Heading8"/>
     <w:uiPriority w:val="9"/>
     <w:semiHidden/>
-    <w:rsid w:val="008953BE"/>
+    <w:rsid w:val="00FF4920"/>
     <w:rPr>
       <w:rFonts w:eastAsiaTheme="majorEastAsia" w:cstheme="majorBidi"/>
       <w:i/>
@@ -884,7 +884,7 @@
     <w:link w:val="Heading9"/>
     <w:uiPriority w:val="9"/>
     <w:semiHidden/>
-    <w:rsid w:val="008953BE"/>
+    <w:rsid w:val="00FF4920"/>
     <w:rPr>
       <w:rFonts w:eastAsiaTheme="majorEastAsia" w:cstheme="majorBidi"/>
       <w:color w:val="272727" w:themeColor="text1" w:themeTint="D8"/>
@@ -897,7 +897,7 @@
     <w:link w:val="TitleChar"/>
     <w:uiPriority w:val="10"/>
     <w:qFormat/>
-    <w:rsid w:val="008953BE"/>
+    <w:rsid w:val="00FF4920"/>
     <w:pPr>
       <w:spacing w:after="80" w:line="240" w:lineRule="auto"/>
       <w:contextualSpacing/>
@@ -915,7 +915,7 @@
     <w:basedOn w:val="DefaultParagraphFont"/>
     <w:link w:val="Title"/>
     <w:uiPriority w:val="10"/>
-    <w:rsid w:val="008953BE"/>
+    <w:rsid w:val="00FF4920"/>
     <w:rPr>
       <w:rFonts w:asciiTheme="majorHAnsi" w:eastAsiaTheme="majorEastAsia" w:hAnsiTheme="majorHAnsi" w:cstheme="majorBidi"/>
       <w:spacing w:val="-10"/>
@@ -931,7 +931,7 @@
     <w:link w:val="SubtitleChar"/>
     <w:uiPriority w:val="11"/>
     <w:qFormat/>
-    <w:rsid w:val="008953BE"/>
+    <w:rsid w:val="00FF4920"/>
     <w:pPr>
       <w:numPr>
         <w:ilvl w:val="1"/>
@@ -950,7 +950,7 @@
     <w:basedOn w:val="DefaultParagraphFont"/>
     <w:link w:val="Subtitle"/>
     <w:uiPriority w:val="11"/>
-    <w:rsid w:val="008953BE"/>
+    <w:rsid w:val="00FF4920"/>
     <w:rPr>
       <w:rFonts w:eastAsiaTheme="majorEastAsia" w:cstheme="majorBidi"/>
       <w:color w:val="595959" w:themeColor="text1" w:themeTint="A6"/>
@@ -966,7 +966,7 @@
     <w:link w:val="QuoteChar"/>
     <w:uiPriority w:val="29"/>
     <w:qFormat/>
-    <w:rsid w:val="008953BE"/>
+    <w:rsid w:val="00FF4920"/>
     <w:pPr>
       <w:spacing w:before="160"/>
       <w:jc w:val="center"/>
@@ -982,7 +982,7 @@
     <w:basedOn w:val="DefaultParagraphFont"/>
     <w:link w:val="Quote"/>
     <w:uiPriority w:val="29"/>
-    <w:rsid w:val="008953BE"/>
+    <w:rsid w:val="00FF4920"/>
     <w:rPr>
       <w:i/>
       <w:iCs/>
@@ -994,7 +994,7 @@
     <w:basedOn w:val="Normal"/>
     <w:uiPriority w:val="34"/>
     <w:qFormat/>
-    <w:rsid w:val="008953BE"/>
+    <w:rsid w:val="00FF4920"/>
     <w:pPr>
       <w:ind w:left="720"/>
       <w:contextualSpacing/>
@@ -1005,7 +1005,7 @@
     <w:basedOn w:val="DefaultParagraphFont"/>
     <w:uiPriority w:val="21"/>
     <w:qFormat/>
-    <w:rsid w:val="008953BE"/>
+    <w:rsid w:val="00FF4920"/>
     <w:rPr>
       <w:i/>
       <w:iCs/>
@@ -1019,7 +1019,7 @@
     <w:link w:val="IntenseQuoteChar"/>
     <w:uiPriority w:val="30"/>
     <w:qFormat/>
-    <w:rsid w:val="008953BE"/>
+    <w:rsid w:val="00FF4920"/>
     <w:pPr>
       <w:pBdr>
         <w:top w:val="single" w:sz="4" w:space="10" w:color="2F5496" w:themeColor="accent1" w:themeShade="BF"/>
@@ -1040,7 +1040,7 @@
     <w:basedOn w:val="DefaultParagraphFont"/>
     <w:link w:val="IntenseQuote"/>
     <w:uiPriority w:val="30"/>
-    <w:rsid w:val="008953BE"/>
+    <w:rsid w:val="00FF4920"/>
     <w:rPr>
       <w:i/>
       <w:iCs/>
@@ -1052,7 +1052,7 @@
     <w:basedOn w:val="DefaultParagraphFont"/>
     <w:uiPriority w:val="32"/>
     <w:qFormat/>
-    <w:rsid w:val="008953BE"/>
+    <w:rsid w:val="00FF4920"/>
     <w:rPr>
       <w:b/>
       <w:bCs/>

</xml_diff>

<commit_message>
Table styles, borders, cell layout and an index of all installed fonts
- Table styles: per-edge borders (style, width, colour), tblBorders and
  tcBorders, conditional formatting (header row, first/last column and
  row, banded rows/columns, corner cells) driven by tblLook, style
  shading and run/paragraph properties
- Cell margins (tblCellMar/tcMar), vertical alignment, vertical merges
  without inner borders, last-paragraph spacing inside cells
- Paragraph borders (pBdr) grouped across paragraphs with equal borders
- Fonts: every installed font, including per-user and Office cloud fonts
  such as Aptos, is indexed from its name table at startup and loaded on
  demand; TrueType collections are supported for screen and PDF
- Parse footnotes.xml/endnotes.xml into note documents (not drawn yet)
- New corpus document 09_table_styles; all 9 round-trip pixel-identically

Co-Authored-By: Claude Opus 5.5 <noreply@anthropic.com>
</commit_message>
<xml_diff>
--- a/tests/corpus/01_styles.docx
+++ b/tests/corpus/01_styles.docx
@@ -555,7 +555,7 @@
     <w:link w:val="Heading1Char"/>
     <w:uiPriority w:val="9"/>
     <w:qFormat/>
-    <w:rsid w:val="00FF4920"/>
+    <w:rsid w:val="00937190"/>
     <w:pPr>
       <w:keepNext/>
       <w:keepLines/>
@@ -577,7 +577,7 @@
     <w:uiPriority w:val="9"/>
     <w:unhideWhenUsed/>
     <w:qFormat/>
-    <w:rsid w:val="00FF4920"/>
+    <w:rsid w:val="00937190"/>
     <w:pPr>
       <w:keepNext/>
       <w:keepLines/>
@@ -600,7 +600,7 @@
     <w:semiHidden/>
     <w:unhideWhenUsed/>
     <w:qFormat/>
-    <w:rsid w:val="00FF4920"/>
+    <w:rsid w:val="00937190"/>
     <w:pPr>
       <w:keepNext/>
       <w:keepLines/>
@@ -623,7 +623,7 @@
     <w:semiHidden/>
     <w:unhideWhenUsed/>
     <w:qFormat/>
-    <w:rsid w:val="00FF4920"/>
+    <w:rsid w:val="00937190"/>
     <w:pPr>
       <w:keepNext/>
       <w:keepLines/>
@@ -646,7 +646,7 @@
     <w:semiHidden/>
     <w:unhideWhenUsed/>
     <w:qFormat/>
-    <w:rsid w:val="00FF4920"/>
+    <w:rsid w:val="00937190"/>
     <w:pPr>
       <w:keepNext/>
       <w:keepLines/>
@@ -667,7 +667,7 @@
     <w:semiHidden/>
     <w:unhideWhenUsed/>
     <w:qFormat/>
-    <w:rsid w:val="00FF4920"/>
+    <w:rsid w:val="00937190"/>
     <w:pPr>
       <w:keepNext/>
       <w:keepLines/>
@@ -690,7 +690,7 @@
     <w:semiHidden/>
     <w:unhideWhenUsed/>
     <w:qFormat/>
-    <w:rsid w:val="00FF4920"/>
+    <w:rsid w:val="00937190"/>
     <w:pPr>
       <w:keepNext/>
       <w:keepLines/>
@@ -711,7 +711,7 @@
     <w:semiHidden/>
     <w:unhideWhenUsed/>
     <w:qFormat/>
-    <w:rsid w:val="00FF4920"/>
+    <w:rsid w:val="00937190"/>
     <w:pPr>
       <w:keepNext/>
       <w:keepLines/>
@@ -734,7 +734,7 @@
     <w:semiHidden/>
     <w:unhideWhenUsed/>
     <w:qFormat/>
-    <w:rsid w:val="00FF4920"/>
+    <w:rsid w:val="00937190"/>
     <w:pPr>
       <w:keepNext/>
       <w:keepLines/>
@@ -777,7 +777,7 @@
     <w:basedOn w:val="DefaultParagraphFont"/>
     <w:link w:val="Heading1"/>
     <w:uiPriority w:val="9"/>
-    <w:rsid w:val="00FF4920"/>
+    <w:rsid w:val="00937190"/>
     <w:rPr>
       <w:rFonts w:asciiTheme="majorHAnsi" w:eastAsiaTheme="majorEastAsia" w:hAnsiTheme="majorHAnsi" w:cstheme="majorBidi"/>
       <w:color w:val="2F5496" w:themeColor="accent1" w:themeShade="BF"/>
@@ -790,7 +790,7 @@
     <w:basedOn w:val="DefaultParagraphFont"/>
     <w:link w:val="Heading2"/>
     <w:uiPriority w:val="9"/>
-    <w:rsid w:val="00FF4920"/>
+    <w:rsid w:val="00937190"/>
     <w:rPr>
       <w:rFonts w:asciiTheme="majorHAnsi" w:eastAsiaTheme="majorEastAsia" w:hAnsiTheme="majorHAnsi" w:cstheme="majorBidi"/>
       <w:color w:val="2F5496" w:themeColor="accent1" w:themeShade="BF"/>
@@ -804,7 +804,7 @@
     <w:link w:val="Heading3"/>
     <w:uiPriority w:val="9"/>
     <w:semiHidden/>
-    <w:rsid w:val="00FF4920"/>
+    <w:rsid w:val="00937190"/>
     <w:rPr>
       <w:rFonts w:eastAsiaTheme="majorEastAsia" w:cstheme="majorBidi"/>
       <w:color w:val="2F5496" w:themeColor="accent1" w:themeShade="BF"/>
@@ -818,7 +818,7 @@
     <w:link w:val="Heading4"/>
     <w:uiPriority w:val="9"/>
     <w:semiHidden/>
-    <w:rsid w:val="00FF4920"/>
+    <w:rsid w:val="00937190"/>
     <w:rPr>
       <w:rFonts w:eastAsiaTheme="majorEastAsia" w:cstheme="majorBidi"/>
       <w:i/>
@@ -832,7 +832,7 @@
     <w:link w:val="Heading5"/>
     <w:uiPriority w:val="9"/>
     <w:semiHidden/>
-    <w:rsid w:val="00FF4920"/>
+    <w:rsid w:val="00937190"/>
     <w:rPr>
       <w:rFonts w:eastAsiaTheme="majorEastAsia" w:cstheme="majorBidi"/>
       <w:color w:val="2F5496" w:themeColor="accent1" w:themeShade="BF"/>
@@ -844,7 +844,7 @@
     <w:link w:val="Heading6"/>
     <w:uiPriority w:val="9"/>
     <w:semiHidden/>
-    <w:rsid w:val="00FF4920"/>
+    <w:rsid w:val="00937190"/>
     <w:rPr>
       <w:rFonts w:eastAsiaTheme="majorEastAsia" w:cstheme="majorBidi"/>
       <w:i/>
@@ -858,7 +858,7 @@
     <w:link w:val="Heading7"/>
     <w:uiPriority w:val="9"/>
     <w:semiHidden/>
-    <w:rsid w:val="00FF4920"/>
+    <w:rsid w:val="00937190"/>
     <w:rPr>
       <w:rFonts w:eastAsiaTheme="majorEastAsia" w:cstheme="majorBidi"/>
       <w:color w:val="595959" w:themeColor="text1" w:themeTint="A6"/>
@@ -870,7 +870,7 @@
     <w:link w:val="Heading8"/>
     <w:uiPriority w:val="9"/>
     <w:semiHidden/>
-    <w:rsid w:val="00FF4920"/>
+    <w:rsid w:val="00937190"/>
     <w:rPr>
       <w:rFonts w:eastAsiaTheme="majorEastAsia" w:cstheme="majorBidi"/>
       <w:i/>
@@ -884,7 +884,7 @@
     <w:link w:val="Heading9"/>
     <w:uiPriority w:val="9"/>
     <w:semiHidden/>
-    <w:rsid w:val="00FF4920"/>
+    <w:rsid w:val="00937190"/>
     <w:rPr>
       <w:rFonts w:eastAsiaTheme="majorEastAsia" w:cstheme="majorBidi"/>
       <w:color w:val="272727" w:themeColor="text1" w:themeTint="D8"/>
@@ -897,7 +897,7 @@
     <w:link w:val="TitleChar"/>
     <w:uiPriority w:val="10"/>
     <w:qFormat/>
-    <w:rsid w:val="00FF4920"/>
+    <w:rsid w:val="00937190"/>
     <w:pPr>
       <w:spacing w:after="80" w:line="240" w:lineRule="auto"/>
       <w:contextualSpacing/>
@@ -915,7 +915,7 @@
     <w:basedOn w:val="DefaultParagraphFont"/>
     <w:link w:val="Title"/>
     <w:uiPriority w:val="10"/>
-    <w:rsid w:val="00FF4920"/>
+    <w:rsid w:val="00937190"/>
     <w:rPr>
       <w:rFonts w:asciiTheme="majorHAnsi" w:eastAsiaTheme="majorEastAsia" w:hAnsiTheme="majorHAnsi" w:cstheme="majorBidi"/>
       <w:spacing w:val="-10"/>
@@ -931,7 +931,7 @@
     <w:link w:val="SubtitleChar"/>
     <w:uiPriority w:val="11"/>
     <w:qFormat/>
-    <w:rsid w:val="00FF4920"/>
+    <w:rsid w:val="00937190"/>
     <w:pPr>
       <w:numPr>
         <w:ilvl w:val="1"/>
@@ -950,7 +950,7 @@
     <w:basedOn w:val="DefaultParagraphFont"/>
     <w:link w:val="Subtitle"/>
     <w:uiPriority w:val="11"/>
-    <w:rsid w:val="00FF4920"/>
+    <w:rsid w:val="00937190"/>
     <w:rPr>
       <w:rFonts w:eastAsiaTheme="majorEastAsia" w:cstheme="majorBidi"/>
       <w:color w:val="595959" w:themeColor="text1" w:themeTint="A6"/>
@@ -966,7 +966,7 @@
     <w:link w:val="QuoteChar"/>
     <w:uiPriority w:val="29"/>
     <w:qFormat/>
-    <w:rsid w:val="00FF4920"/>
+    <w:rsid w:val="00937190"/>
     <w:pPr>
       <w:spacing w:before="160"/>
       <w:jc w:val="center"/>
@@ -982,7 +982,7 @@
     <w:basedOn w:val="DefaultParagraphFont"/>
     <w:link w:val="Quote"/>
     <w:uiPriority w:val="29"/>
-    <w:rsid w:val="00FF4920"/>
+    <w:rsid w:val="00937190"/>
     <w:rPr>
       <w:i/>
       <w:iCs/>
@@ -994,7 +994,7 @@
     <w:basedOn w:val="Normal"/>
     <w:uiPriority w:val="34"/>
     <w:qFormat/>
-    <w:rsid w:val="00FF4920"/>
+    <w:rsid w:val="00937190"/>
     <w:pPr>
       <w:ind w:left="720"/>
       <w:contextualSpacing/>
@@ -1005,7 +1005,7 @@
     <w:basedOn w:val="DefaultParagraphFont"/>
     <w:uiPriority w:val="21"/>
     <w:qFormat/>
-    <w:rsid w:val="00FF4920"/>
+    <w:rsid w:val="00937190"/>
     <w:rPr>
       <w:i/>
       <w:iCs/>
@@ -1019,7 +1019,7 @@
     <w:link w:val="IntenseQuoteChar"/>
     <w:uiPriority w:val="30"/>
     <w:qFormat/>
-    <w:rsid w:val="00FF4920"/>
+    <w:rsid w:val="00937190"/>
     <w:pPr>
       <w:pBdr>
         <w:top w:val="single" w:sz="4" w:space="10" w:color="2F5496" w:themeColor="accent1" w:themeShade="BF"/>
@@ -1040,7 +1040,7 @@
     <w:basedOn w:val="DefaultParagraphFont"/>
     <w:link w:val="IntenseQuote"/>
     <w:uiPriority w:val="30"/>
-    <w:rsid w:val="00FF4920"/>
+    <w:rsid w:val="00937190"/>
     <w:rPr>
       <w:i/>
       <w:iCs/>
@@ -1052,7 +1052,7 @@
     <w:basedOn w:val="DefaultParagraphFont"/>
     <w:uiPriority w:val="32"/>
     <w:qFormat/>
-    <w:rsid w:val="00FF4920"/>
+    <w:rsid w:val="00937190"/>
     <w:rPr>
       <w:b/>
       <w:bCs/>

</xml_diff>

<commit_message>
Position floating pictures and shapes like Word
- Read wp:anchor placement: horizontal position relative to page,
  margin, column or character and vertical relative to page, margin,
  paragraph or line, as offsets or alignments; wrap mode and behindDoc
- Floating objects take no inline space; they are drawn at their page
  position behind or in front of the text, also in PDF export
- Wrapping objects keep text clear: following lines, including the
  anchor paragraph's own, skip the object's vertical extent
- Clicking a floating picture selects it; the resize handle follows it
- New corpus document 10_floating; all 10 round-trip pixel-identically
  and stress-edited results open cleanly in Word

Co-Authored-By: Claude Opus 5.5 <noreply@anthropic.com>
</commit_message>
<xml_diff>
--- a/tests/corpus/01_styles.docx
+++ b/tests/corpus/01_styles.docx
@@ -555,7 +555,7 @@
     <w:link w:val="Heading1Char"/>
     <w:uiPriority w:val="9"/>
     <w:qFormat/>
-    <w:rsid w:val="00937190"/>
+    <w:rsid w:val="005F3BFE"/>
     <w:pPr>
       <w:keepNext/>
       <w:keepLines/>
@@ -577,7 +577,7 @@
     <w:uiPriority w:val="9"/>
     <w:unhideWhenUsed/>
     <w:qFormat/>
-    <w:rsid w:val="00937190"/>
+    <w:rsid w:val="005F3BFE"/>
     <w:pPr>
       <w:keepNext/>
       <w:keepLines/>
@@ -600,7 +600,7 @@
     <w:semiHidden/>
     <w:unhideWhenUsed/>
     <w:qFormat/>
-    <w:rsid w:val="00937190"/>
+    <w:rsid w:val="005F3BFE"/>
     <w:pPr>
       <w:keepNext/>
       <w:keepLines/>
@@ -623,7 +623,7 @@
     <w:semiHidden/>
     <w:unhideWhenUsed/>
     <w:qFormat/>
-    <w:rsid w:val="00937190"/>
+    <w:rsid w:val="005F3BFE"/>
     <w:pPr>
       <w:keepNext/>
       <w:keepLines/>
@@ -646,7 +646,7 @@
     <w:semiHidden/>
     <w:unhideWhenUsed/>
     <w:qFormat/>
-    <w:rsid w:val="00937190"/>
+    <w:rsid w:val="005F3BFE"/>
     <w:pPr>
       <w:keepNext/>
       <w:keepLines/>
@@ -667,7 +667,7 @@
     <w:semiHidden/>
     <w:unhideWhenUsed/>
     <w:qFormat/>
-    <w:rsid w:val="00937190"/>
+    <w:rsid w:val="005F3BFE"/>
     <w:pPr>
       <w:keepNext/>
       <w:keepLines/>
@@ -690,7 +690,7 @@
     <w:semiHidden/>
     <w:unhideWhenUsed/>
     <w:qFormat/>
-    <w:rsid w:val="00937190"/>
+    <w:rsid w:val="005F3BFE"/>
     <w:pPr>
       <w:keepNext/>
       <w:keepLines/>
@@ -711,7 +711,7 @@
     <w:semiHidden/>
     <w:unhideWhenUsed/>
     <w:qFormat/>
-    <w:rsid w:val="00937190"/>
+    <w:rsid w:val="005F3BFE"/>
     <w:pPr>
       <w:keepNext/>
       <w:keepLines/>
@@ -734,7 +734,7 @@
     <w:semiHidden/>
     <w:unhideWhenUsed/>
     <w:qFormat/>
-    <w:rsid w:val="00937190"/>
+    <w:rsid w:val="005F3BFE"/>
     <w:pPr>
       <w:keepNext/>
       <w:keepLines/>
@@ -777,7 +777,7 @@
     <w:basedOn w:val="DefaultParagraphFont"/>
     <w:link w:val="Heading1"/>
     <w:uiPriority w:val="9"/>
-    <w:rsid w:val="00937190"/>
+    <w:rsid w:val="005F3BFE"/>
     <w:rPr>
       <w:rFonts w:asciiTheme="majorHAnsi" w:eastAsiaTheme="majorEastAsia" w:hAnsiTheme="majorHAnsi" w:cstheme="majorBidi"/>
       <w:color w:val="2F5496" w:themeColor="accent1" w:themeShade="BF"/>
@@ -790,7 +790,7 @@
     <w:basedOn w:val="DefaultParagraphFont"/>
     <w:link w:val="Heading2"/>
     <w:uiPriority w:val="9"/>
-    <w:rsid w:val="00937190"/>
+    <w:rsid w:val="005F3BFE"/>
     <w:rPr>
       <w:rFonts w:asciiTheme="majorHAnsi" w:eastAsiaTheme="majorEastAsia" w:hAnsiTheme="majorHAnsi" w:cstheme="majorBidi"/>
       <w:color w:val="2F5496" w:themeColor="accent1" w:themeShade="BF"/>
@@ -804,7 +804,7 @@
     <w:link w:val="Heading3"/>
     <w:uiPriority w:val="9"/>
     <w:semiHidden/>
-    <w:rsid w:val="00937190"/>
+    <w:rsid w:val="005F3BFE"/>
     <w:rPr>
       <w:rFonts w:eastAsiaTheme="majorEastAsia" w:cstheme="majorBidi"/>
       <w:color w:val="2F5496" w:themeColor="accent1" w:themeShade="BF"/>
@@ -818,7 +818,7 @@
     <w:link w:val="Heading4"/>
     <w:uiPriority w:val="9"/>
     <w:semiHidden/>
-    <w:rsid w:val="00937190"/>
+    <w:rsid w:val="005F3BFE"/>
     <w:rPr>
       <w:rFonts w:eastAsiaTheme="majorEastAsia" w:cstheme="majorBidi"/>
       <w:i/>
@@ -832,7 +832,7 @@
     <w:link w:val="Heading5"/>
     <w:uiPriority w:val="9"/>
     <w:semiHidden/>
-    <w:rsid w:val="00937190"/>
+    <w:rsid w:val="005F3BFE"/>
     <w:rPr>
       <w:rFonts w:eastAsiaTheme="majorEastAsia" w:cstheme="majorBidi"/>
       <w:color w:val="2F5496" w:themeColor="accent1" w:themeShade="BF"/>
@@ -844,7 +844,7 @@
     <w:link w:val="Heading6"/>
     <w:uiPriority w:val="9"/>
     <w:semiHidden/>
-    <w:rsid w:val="00937190"/>
+    <w:rsid w:val="005F3BFE"/>
     <w:rPr>
       <w:rFonts w:eastAsiaTheme="majorEastAsia" w:cstheme="majorBidi"/>
       <w:i/>
@@ -858,7 +858,7 @@
     <w:link w:val="Heading7"/>
     <w:uiPriority w:val="9"/>
     <w:semiHidden/>
-    <w:rsid w:val="00937190"/>
+    <w:rsid w:val="005F3BFE"/>
     <w:rPr>
       <w:rFonts w:eastAsiaTheme="majorEastAsia" w:cstheme="majorBidi"/>
       <w:color w:val="595959" w:themeColor="text1" w:themeTint="A6"/>
@@ -870,7 +870,7 @@
     <w:link w:val="Heading8"/>
     <w:uiPriority w:val="9"/>
     <w:semiHidden/>
-    <w:rsid w:val="00937190"/>
+    <w:rsid w:val="005F3BFE"/>
     <w:rPr>
       <w:rFonts w:eastAsiaTheme="majorEastAsia" w:cstheme="majorBidi"/>
       <w:i/>
@@ -884,7 +884,7 @@
     <w:link w:val="Heading9"/>
     <w:uiPriority w:val="9"/>
     <w:semiHidden/>
-    <w:rsid w:val="00937190"/>
+    <w:rsid w:val="005F3BFE"/>
     <w:rPr>
       <w:rFonts w:eastAsiaTheme="majorEastAsia" w:cstheme="majorBidi"/>
       <w:color w:val="272727" w:themeColor="text1" w:themeTint="D8"/>
@@ -897,7 +897,7 @@
     <w:link w:val="TitleChar"/>
     <w:uiPriority w:val="10"/>
     <w:qFormat/>
-    <w:rsid w:val="00937190"/>
+    <w:rsid w:val="005F3BFE"/>
     <w:pPr>
       <w:spacing w:after="80" w:line="240" w:lineRule="auto"/>
       <w:contextualSpacing/>
@@ -915,7 +915,7 @@
     <w:basedOn w:val="DefaultParagraphFont"/>
     <w:link w:val="Title"/>
     <w:uiPriority w:val="10"/>
-    <w:rsid w:val="00937190"/>
+    <w:rsid w:val="005F3BFE"/>
     <w:rPr>
       <w:rFonts w:asciiTheme="majorHAnsi" w:eastAsiaTheme="majorEastAsia" w:hAnsiTheme="majorHAnsi" w:cstheme="majorBidi"/>
       <w:spacing w:val="-10"/>
@@ -931,7 +931,7 @@
     <w:link w:val="SubtitleChar"/>
     <w:uiPriority w:val="11"/>
     <w:qFormat/>
-    <w:rsid w:val="00937190"/>
+    <w:rsid w:val="005F3BFE"/>
     <w:pPr>
       <w:numPr>
         <w:ilvl w:val="1"/>
@@ -950,7 +950,7 @@
     <w:basedOn w:val="DefaultParagraphFont"/>
     <w:link w:val="Subtitle"/>
     <w:uiPriority w:val="11"/>
-    <w:rsid w:val="00937190"/>
+    <w:rsid w:val="005F3BFE"/>
     <w:rPr>
       <w:rFonts w:eastAsiaTheme="majorEastAsia" w:cstheme="majorBidi"/>
       <w:color w:val="595959" w:themeColor="text1" w:themeTint="A6"/>
@@ -966,7 +966,7 @@
     <w:link w:val="QuoteChar"/>
     <w:uiPriority w:val="29"/>
     <w:qFormat/>
-    <w:rsid w:val="00937190"/>
+    <w:rsid w:val="005F3BFE"/>
     <w:pPr>
       <w:spacing w:before="160"/>
       <w:jc w:val="center"/>
@@ -982,7 +982,7 @@
     <w:basedOn w:val="DefaultParagraphFont"/>
     <w:link w:val="Quote"/>
     <w:uiPriority w:val="29"/>
-    <w:rsid w:val="00937190"/>
+    <w:rsid w:val="005F3BFE"/>
     <w:rPr>
       <w:i/>
       <w:iCs/>
@@ -994,7 +994,7 @@
     <w:basedOn w:val="Normal"/>
     <w:uiPriority w:val="34"/>
     <w:qFormat/>
-    <w:rsid w:val="00937190"/>
+    <w:rsid w:val="005F3BFE"/>
     <w:pPr>
       <w:ind w:left="720"/>
       <w:contextualSpacing/>
@@ -1005,7 +1005,7 @@
     <w:basedOn w:val="DefaultParagraphFont"/>
     <w:uiPriority w:val="21"/>
     <w:qFormat/>
-    <w:rsid w:val="00937190"/>
+    <w:rsid w:val="005F3BFE"/>
     <w:rPr>
       <w:i/>
       <w:iCs/>
@@ -1019,7 +1019,7 @@
     <w:link w:val="IntenseQuoteChar"/>
     <w:uiPriority w:val="30"/>
     <w:qFormat/>
-    <w:rsid w:val="00937190"/>
+    <w:rsid w:val="005F3BFE"/>
     <w:pPr>
       <w:pBdr>
         <w:top w:val="single" w:sz="4" w:space="10" w:color="2F5496" w:themeColor="accent1" w:themeShade="BF"/>
@@ -1040,7 +1040,7 @@
     <w:basedOn w:val="DefaultParagraphFont"/>
     <w:link w:val="IntenseQuote"/>
     <w:uiPriority w:val="30"/>
-    <w:rsid w:val="00937190"/>
+    <w:rsid w:val="005F3BFE"/>
     <w:rPr>
       <w:i/>
       <w:iCs/>
@@ -1052,7 +1052,7 @@
     <w:basedOn w:val="DefaultParagraphFont"/>
     <w:uiPriority w:val="32"/>
     <w:qFormat/>
-    <w:rsid w:val="00937190"/>
+    <w:rsid w:val="005F3BFE"/>
     <w:rPr>
       <w:b/>
       <w:bCs/>

</xml_diff>